<commit_message>
"2.18.0 - Catálogo de Equipos (Laptops y Celulares) & Responsivas Automáticas
</commit_message>
<xml_diff>
--- a/Plantillas/formato_celular.docx
+++ b/Plantillas/formato_celular.docx
@@ -4173,36 +4173,66 @@
           <w:rFonts w:ascii="Times New Roman"/>
           <w:b w:val="0"/>
         </w:rPr>
-        <w:t xml:space="preserve">Fecha de ingreso: </w:t>
+        <w:t xml:space="preserve">Fecha </w:t>
       </w:r>
       <w:r>
         <w:rPr>
           <w:rFonts w:ascii="Times New Roman"/>
           <w:b w:val="0"/>
         </w:rPr>
-        <w:t>{{</w:t>
+        <w:t>contrataci</w:t>
       </w:r>
       <w:r>
         <w:rPr>
           <w:rFonts w:ascii="Times New Roman"/>
           <w:b w:val="0"/>
         </w:rPr>
-        <w:t>fecha</w:t>
+        <w:t>ó</w:t>
       </w:r>
       <w:r>
         <w:rPr>
           <w:rFonts w:ascii="Times New Roman"/>
           <w:b w:val="0"/>
         </w:rPr>
-        <w:t>_</w:t>
+        <w:t>n</w:t>
       </w:r>
       <w:r>
         <w:rPr>
           <w:rFonts w:ascii="Times New Roman"/>
           <w:b w:val="0"/>
         </w:rPr>
+        <w:t xml:space="preserve">: </w:t>
+      </w:r>
+      <w:r>
+        <w:rPr>
+          <w:rFonts w:ascii="Times New Roman"/>
+          <w:b w:val="0"/>
+        </w:rPr>
+        <w:t>{{</w:t>
+      </w:r>
+      <w:proofErr w:type="spellStart"/>
+      <w:r>
+        <w:rPr>
+          <w:rFonts w:ascii="Times New Roman"/>
+          <w:b w:val="0"/>
+        </w:rPr>
+        <w:t>fecha</w:t>
+      </w:r>
+      <w:r>
+        <w:rPr>
+          <w:rFonts w:ascii="Times New Roman"/>
+          <w:b w:val="0"/>
+        </w:rPr>
+        <w:t>_</w:t>
+      </w:r>
+      <w:r>
+        <w:rPr>
+          <w:rFonts w:ascii="Times New Roman"/>
+          <w:b w:val="0"/>
+        </w:rPr>
         <w:t>ingreso</w:t>
       </w:r>
+      <w:proofErr w:type="spellEnd"/>
       <w:r>
         <w:rPr>
           <w:rFonts w:ascii="Times New Roman"/>
@@ -5180,7 +5210,12 @@
 </file>
 
 <file path=customXml/item1.xml><?xml version="1.0" encoding="utf-8"?>
-<b:Sources xmlns:b="http://schemas.openxmlformats.org/officeDocument/2006/bibliography" xmlns="http://schemas.openxmlformats.org/officeDocument/2006/bibliography" SelectedStyle="\APASixthEditionOfficeOnline.xsl" StyleName="APA" Version="6"/>
+<?mso-contentType ?>
+<FormTemplates xmlns="http://schemas.microsoft.com/sharepoint/v3/contenttype/forms">
+  <Display>DocumentLibraryForm</Display>
+  <Edit>DocumentLibraryForm</Edit>
+  <New>DocumentLibraryForm</New>
+</FormTemplates>
 </file>
 
 <file path=customXml/item2.xml><?xml version="1.0" encoding="utf-8"?>
@@ -5195,12 +5230,7 @@
 </file>
 
 <file path=customXml/item3.xml><?xml version="1.0" encoding="utf-8"?>
-<?mso-contentType ?>
-<FormTemplates xmlns="http://schemas.microsoft.com/sharepoint/v3/contenttype/forms">
-  <Display>DocumentLibraryForm</Display>
-  <Edit>DocumentLibraryForm</Edit>
-  <New>DocumentLibraryForm</New>
-</FormTemplates>
+<b:Sources xmlns:b="http://schemas.openxmlformats.org/officeDocument/2006/bibliography" xmlns="http://schemas.openxmlformats.org/officeDocument/2006/bibliography" SelectedStyle="\APASixthEditionOfficeOnline.xsl" StyleName="APA" Version="6"/>
 </file>
 
 <file path=customXml/item4.xml><?xml version="1.0" encoding="utf-8"?>
@@ -5445,9 +5475,9 @@
 </file>
 
 <file path=customXml/itemProps1.xml><?xml version="1.0" encoding="utf-8"?>
-<ds:datastoreItem xmlns:ds="http://schemas.openxmlformats.org/officeDocument/2006/customXml" ds:itemID="{0A173BE3-78D4-42C0-8541-0D1984B7DCDA}">
+<ds:datastoreItem xmlns:ds="http://schemas.openxmlformats.org/officeDocument/2006/customXml" ds:itemID="{74C36031-48D6-47DE-9F3D-EAD5BFAD009C}">
   <ds:schemaRefs>
-    <ds:schemaRef ds:uri="http://schemas.openxmlformats.org/officeDocument/2006/bibliography"/>
+    <ds:schemaRef ds:uri="http://schemas.microsoft.com/sharepoint/v3/contenttype/forms"/>
   </ds:schemaRefs>
 </ds:datastoreItem>
 </file>
@@ -5464,9 +5494,9 @@
 </file>
 
 <file path=customXml/itemProps3.xml><?xml version="1.0" encoding="utf-8"?>
-<ds:datastoreItem xmlns:ds="http://schemas.openxmlformats.org/officeDocument/2006/customXml" ds:itemID="{74C36031-48D6-47DE-9F3D-EAD5BFAD009C}">
+<ds:datastoreItem xmlns:ds="http://schemas.openxmlformats.org/officeDocument/2006/customXml" ds:itemID="{0A173BE3-78D4-42C0-8541-0D1984B7DCDA}">
   <ds:schemaRefs>
-    <ds:schemaRef ds:uri="http://schemas.microsoft.com/sharepoint/v3/contenttype/forms"/>
+    <ds:schemaRef ds:uri="http://schemas.openxmlformats.org/officeDocument/2006/bibliography"/>
   </ds:schemaRefs>
 </ds:datastoreItem>
 </file>

</xml_diff>

<commit_message>
2.18.0 - Catálogo de Equipos (Laptops y Celulares) & Responsivas Automáticas (#16)
* 2.15 - Fix Keep-Alive Socket Closure (Removal of Connection Close)

* 2.16.1 - Base 2.16 Pura (Sin fitz/psutil) + Búsqueda Avanzada de Clientes y Agencias

* "2.18.0 - Catálogo de Equipos (Laptops y Celulares) & Responsivas Automáticas
</commit_message>
<xml_diff>
--- a/Plantillas/formato_celular.docx
+++ b/Plantillas/formato_celular.docx
@@ -4173,36 +4173,66 @@
           <w:rFonts w:ascii="Times New Roman"/>
           <w:b w:val="0"/>
         </w:rPr>
-        <w:t xml:space="preserve">Fecha de ingreso: </w:t>
+        <w:t xml:space="preserve">Fecha </w:t>
       </w:r>
       <w:r>
         <w:rPr>
           <w:rFonts w:ascii="Times New Roman"/>
           <w:b w:val="0"/>
         </w:rPr>
-        <w:t>{{</w:t>
+        <w:t>contrataci</w:t>
       </w:r>
       <w:r>
         <w:rPr>
           <w:rFonts w:ascii="Times New Roman"/>
           <w:b w:val="0"/>
         </w:rPr>
-        <w:t>fecha</w:t>
+        <w:t>ó</w:t>
       </w:r>
       <w:r>
         <w:rPr>
           <w:rFonts w:ascii="Times New Roman"/>
           <w:b w:val="0"/>
         </w:rPr>
-        <w:t>_</w:t>
+        <w:t>n</w:t>
       </w:r>
       <w:r>
         <w:rPr>
           <w:rFonts w:ascii="Times New Roman"/>
           <w:b w:val="0"/>
         </w:rPr>
+        <w:t xml:space="preserve">: </w:t>
+      </w:r>
+      <w:r>
+        <w:rPr>
+          <w:rFonts w:ascii="Times New Roman"/>
+          <w:b w:val="0"/>
+        </w:rPr>
+        <w:t>{{</w:t>
+      </w:r>
+      <w:proofErr w:type="spellStart"/>
+      <w:r>
+        <w:rPr>
+          <w:rFonts w:ascii="Times New Roman"/>
+          <w:b w:val="0"/>
+        </w:rPr>
+        <w:t>fecha</w:t>
+      </w:r>
+      <w:r>
+        <w:rPr>
+          <w:rFonts w:ascii="Times New Roman"/>
+          <w:b w:val="0"/>
+        </w:rPr>
+        <w:t>_</w:t>
+      </w:r>
+      <w:r>
+        <w:rPr>
+          <w:rFonts w:ascii="Times New Roman"/>
+          <w:b w:val="0"/>
+        </w:rPr>
         <w:t>ingreso</w:t>
       </w:r>
+      <w:proofErr w:type="spellEnd"/>
       <w:r>
         <w:rPr>
           <w:rFonts w:ascii="Times New Roman"/>
@@ -5180,7 +5210,12 @@
 </file>
 
 <file path=customXml/item1.xml><?xml version="1.0" encoding="utf-8"?>
-<b:Sources xmlns:b="http://schemas.openxmlformats.org/officeDocument/2006/bibliography" xmlns="http://schemas.openxmlformats.org/officeDocument/2006/bibliography" SelectedStyle="\APASixthEditionOfficeOnline.xsl" StyleName="APA" Version="6"/>
+<?mso-contentType ?>
+<FormTemplates xmlns="http://schemas.microsoft.com/sharepoint/v3/contenttype/forms">
+  <Display>DocumentLibraryForm</Display>
+  <Edit>DocumentLibraryForm</Edit>
+  <New>DocumentLibraryForm</New>
+</FormTemplates>
 </file>
 
 <file path=customXml/item2.xml><?xml version="1.0" encoding="utf-8"?>
@@ -5195,12 +5230,7 @@
 </file>
 
 <file path=customXml/item3.xml><?xml version="1.0" encoding="utf-8"?>
-<?mso-contentType ?>
-<FormTemplates xmlns="http://schemas.microsoft.com/sharepoint/v3/contenttype/forms">
-  <Display>DocumentLibraryForm</Display>
-  <Edit>DocumentLibraryForm</Edit>
-  <New>DocumentLibraryForm</New>
-</FormTemplates>
+<b:Sources xmlns:b="http://schemas.openxmlformats.org/officeDocument/2006/bibliography" xmlns="http://schemas.openxmlformats.org/officeDocument/2006/bibliography" SelectedStyle="\APASixthEditionOfficeOnline.xsl" StyleName="APA" Version="6"/>
 </file>
 
 <file path=customXml/item4.xml><?xml version="1.0" encoding="utf-8"?>
@@ -5445,9 +5475,9 @@
 </file>
 
 <file path=customXml/itemProps1.xml><?xml version="1.0" encoding="utf-8"?>
-<ds:datastoreItem xmlns:ds="http://schemas.openxmlformats.org/officeDocument/2006/customXml" ds:itemID="{0A173BE3-78D4-42C0-8541-0D1984B7DCDA}">
+<ds:datastoreItem xmlns:ds="http://schemas.openxmlformats.org/officeDocument/2006/customXml" ds:itemID="{74C36031-48D6-47DE-9F3D-EAD5BFAD009C}">
   <ds:schemaRefs>
-    <ds:schemaRef ds:uri="http://schemas.openxmlformats.org/officeDocument/2006/bibliography"/>
+    <ds:schemaRef ds:uri="http://schemas.microsoft.com/sharepoint/v3/contenttype/forms"/>
   </ds:schemaRefs>
 </ds:datastoreItem>
 </file>
@@ -5464,9 +5494,9 @@
 </file>
 
 <file path=customXml/itemProps3.xml><?xml version="1.0" encoding="utf-8"?>
-<ds:datastoreItem xmlns:ds="http://schemas.openxmlformats.org/officeDocument/2006/customXml" ds:itemID="{74C36031-48D6-47DE-9F3D-EAD5BFAD009C}">
+<ds:datastoreItem xmlns:ds="http://schemas.openxmlformats.org/officeDocument/2006/customXml" ds:itemID="{0A173BE3-78D4-42C0-8541-0D1984B7DCDA}">
   <ds:schemaRefs>
-    <ds:schemaRef ds:uri="http://schemas.microsoft.com/sharepoint/v3/contenttype/forms"/>
+    <ds:schemaRef ds:uri="http://schemas.openxmlformats.org/officeDocument/2006/bibliography"/>
   </ds:schemaRefs>
 </ds:datastoreItem>
 </file>

</xml_diff>